<commit_message>
Task 2: three Alpine release images (1.0.0, 1.1.0, 1.2.0-broken)
</commit_message>
<xml_diff>
--- a/Report.docx
+++ b/Report.docx
@@ -16,15 +16,7 @@
         </w:numPr>
       </w:pPr>
       <w:r>
-        <w:t>Create a kind cluster named cte412-&lt;</w:t>
-      </w:r>
-      <w:proofErr w:type="spellStart"/>
-      <w:r>
-        <w:t>sid</w:t>
-      </w:r>
-      <w:proofErr w:type="spellEnd"/>
-      <w:r>
-        <w:t>&gt; with one control-plane node and two worker nodes.</w:t>
+        <w:t>Create a kind cluster named cte412-&lt;sid&gt; with one control-plane node and two worker nodes.</w:t>
       </w:r>
       <w:r>
         <w:t xml:space="preserve"> </w:t>
@@ -127,23 +119,7 @@
       </w:pPr>
       <w:r>
         <w:lastRenderedPageBreak/>
-        <w:t xml:space="preserve">Create the namespace </w:t>
-      </w:r>
-      <w:proofErr w:type="spellStart"/>
-      <w:r>
-        <w:t>nb</w:t>
-      </w:r>
-      <w:proofErr w:type="spellEnd"/>
-      <w:r>
-        <w:t>-&lt;</w:t>
-      </w:r>
-      <w:proofErr w:type="spellStart"/>
-      <w:r>
-        <w:t>sid</w:t>
-      </w:r>
-      <w:proofErr w:type="spellEnd"/>
-      <w:r>
-        <w:t>&gt; with the labels app.kubernetes.io/part-of=campus-noticeboard and cte412/practical="06", and an annotation recording your full name.</w:t>
+        <w:t>Create the namespace nb-&lt;sid&gt; with the labels app.kubernetes.io/part-of=campus-noticeboard and cte412/practical="06", and an annotation recording your full name.</w:t>
       </w:r>
     </w:p>
     <w:p>
@@ -194,51 +170,7 @@
         </w:numPr>
       </w:pPr>
       <w:r>
-        <w:t xml:space="preserve">In that namespace, create a </w:t>
-      </w:r>
-      <w:proofErr w:type="spellStart"/>
-      <w:r>
-        <w:t>ResourceQuota</w:t>
-      </w:r>
-      <w:proofErr w:type="spellEnd"/>
-      <w:r>
-        <w:t xml:space="preserve"> with these hard limits: </w:t>
-      </w:r>
-      <w:proofErr w:type="spellStart"/>
-      <w:r>
-        <w:t>requests.cpu</w:t>
-      </w:r>
-      <w:proofErr w:type="spellEnd"/>
-      <w:r>
-        <w:t xml:space="preserve"> 1, </w:t>
-      </w:r>
-      <w:proofErr w:type="spellStart"/>
-      <w:proofErr w:type="gramStart"/>
-      <w:r>
-        <w:t>requests.memory</w:t>
-      </w:r>
-      <w:proofErr w:type="spellEnd"/>
-      <w:proofErr w:type="gramEnd"/>
-      <w:r>
-        <w:t xml:space="preserve"> 1Gi, </w:t>
-      </w:r>
-      <w:proofErr w:type="spellStart"/>
-      <w:r>
-        <w:t>limits.cpu</w:t>
-      </w:r>
-      <w:proofErr w:type="spellEnd"/>
-      <w:r>
-        <w:t xml:space="preserve"> 2, </w:t>
-      </w:r>
-      <w:proofErr w:type="spellStart"/>
-      <w:proofErr w:type="gramStart"/>
-      <w:r>
-        <w:t>limits.memory</w:t>
-      </w:r>
-      <w:proofErr w:type="spellEnd"/>
-      <w:proofErr w:type="gramEnd"/>
-      <w:r>
-        <w:t xml:space="preserve"> 2Gi, pods 15, count/services 4.</w:t>
+        <w:t>In that namespace, create a ResourceQuota with these hard limits: requests.cpu 1, requests.memory 1Gi, limits.cpu 2, limits.memory 2Gi, pods 15, count/services 4.</w:t>
       </w:r>
     </w:p>
     <w:p>
@@ -289,15 +221,7 @@
         </w:numPr>
       </w:pPr>
       <w:r>
-        <w:t xml:space="preserve">Create a </w:t>
-      </w:r>
-      <w:proofErr w:type="spellStart"/>
-      <w:r>
-        <w:t>LimitRange</w:t>
-      </w:r>
-      <w:proofErr w:type="spellEnd"/>
-      <w:r>
-        <w:t xml:space="preserve"> supplying default requests and limits for containers. Choose the values yourself and justify each one in a comment against the quota above.</w:t>
+        <w:t>Create a LimitRange supplying default requests and limits for containers. Choose the values yourself and justify each one in a comment against the quota above.</w:t>
       </w:r>
     </w:p>
     <w:p>
@@ -349,31 +273,7 @@
         </w:numPr>
       </w:pPr>
       <w:r>
-        <w:t xml:space="preserve">Make </w:t>
-      </w:r>
-      <w:proofErr w:type="spellStart"/>
-      <w:r>
-        <w:t>nb</w:t>
-      </w:r>
-      <w:proofErr w:type="spellEnd"/>
-      <w:r>
-        <w:t>-&lt;</w:t>
-      </w:r>
-      <w:proofErr w:type="spellStart"/>
-      <w:r>
-        <w:t>sid</w:t>
-      </w:r>
-      <w:proofErr w:type="spellEnd"/>
-      <w:r>
-        <w:t xml:space="preserve">&gt; the default namespace of your </w:t>
-      </w:r>
-      <w:proofErr w:type="spellStart"/>
-      <w:r>
-        <w:t>kubectl</w:t>
-      </w:r>
-      <w:proofErr w:type="spellEnd"/>
-      <w:r>
-        <w:t xml:space="preserve"> context.</w:t>
+        <w:t>Make nb-&lt;sid&gt; the default namespace of your kubectl context.</w:t>
       </w:r>
     </w:p>
     <w:p>
@@ -547,15 +447,7 @@
         </w:numPr>
       </w:pPr>
       <w:r>
-        <w:t xml:space="preserve">Every version </w:t>
-      </w:r>
-      <w:proofErr w:type="gramStart"/>
-      <w:r>
-        <w:t>listens</w:t>
-      </w:r>
-      <w:proofErr w:type="gramEnd"/>
-      <w:r>
-        <w:t xml:space="preserve"> on port 8080, runs as a non-root user, and exposes three endpoints. GET</w:t>
+        <w:t>Every version listens on port 8080, runs as a non-root user, and exposes three endpoints. GET</w:t>
       </w:r>
       <w:r>
         <w:t xml:space="preserve"> </w:t>
@@ -567,23 +459,7 @@
         <w:t xml:space="preserve"> s</w:t>
       </w:r>
       <w:r>
-        <w:t>tudent (your &lt;</w:t>
-      </w:r>
-      <w:proofErr w:type="spellStart"/>
-      <w:r>
-        <w:t>sid</w:t>
-      </w:r>
-      <w:proofErr w:type="spellEnd"/>
-      <w:r>
-        <w:t>&gt;) and pod (the container hostname). GET /</w:t>
-      </w:r>
-      <w:proofErr w:type="spellStart"/>
-      <w:r>
-        <w:t>healthz</w:t>
-      </w:r>
-      <w:proofErr w:type="spellEnd"/>
-      <w:r>
-        <w:t xml:space="preserve"> returns HTTP 200 when</w:t>
+        <w:t>tudent (your &lt;sid&gt;) and pod (the container hostname). GET /healthz returns HTTP 200 when</w:t>
       </w:r>
       <w:r>
         <w:t xml:space="preserve"> </w:t>
@@ -601,23 +477,7 @@
         </w:numPr>
       </w:pPr>
       <w:r>
-        <w:t>docker tag noticeboard-</w:t>
-      </w:r>
-      <w:proofErr w:type="gramStart"/>
-      <w:r>
-        <w:t>app:v</w:t>
-      </w:r>
-      <w:proofErr w:type="gramEnd"/>
-      <w:r>
-        <w:t xml:space="preserve">1.0.0 </w:t>
-      </w:r>
-      <w:proofErr w:type="gramStart"/>
-      <w:r>
-        <w:t>notice-board</w:t>
-      </w:r>
-      <w:proofErr w:type="gramEnd"/>
-      <w:r>
-        <w:t>:02230129-1.0.0</w:t>
+        <w:t>docker tag noticeboard-app:v1.0.0 notice-board:02230129-1.0.0</w:t>
       </w:r>
     </w:p>
     <w:p>
@@ -629,39 +489,7 @@
         </w:numPr>
       </w:pPr>
       <w:r>
-        <w:t xml:space="preserve">Tag </w:t>
-      </w:r>
-      <w:proofErr w:type="gramStart"/>
-      <w:r>
-        <w:t>notice-board</w:t>
-      </w:r>
-      <w:proofErr w:type="gramEnd"/>
-      <w:r>
-        <w:t>:&lt;</w:t>
-      </w:r>
-      <w:proofErr w:type="spellStart"/>
-      <w:r>
-        <w:t>sid</w:t>
-      </w:r>
-      <w:proofErr w:type="spellEnd"/>
-      <w:r>
-        <w:t>&gt;-1.1.0 — adds a category field to every notice and a pinned Boolean to at least one. When the environment variable FEATURE_PINNED equals true, pinned notices are listed first and the response body includes "</w:t>
-      </w:r>
-      <w:proofErr w:type="spellStart"/>
-      <w:r>
-        <w:t>pinnedFirst</w:t>
-      </w:r>
-      <w:proofErr w:type="spellEnd"/>
-      <w:r>
-        <w:t xml:space="preserve">": true; </w:t>
-      </w:r>
-      <w:proofErr w:type="gramStart"/>
-      <w:r>
-        <w:t>otherwise</w:t>
-      </w:r>
-      <w:proofErr w:type="gramEnd"/>
-      <w:r>
-        <w:t xml:space="preserve"> the order is unchanged and the field is false.</w:t>
+        <w:t>Tag notice-board:&lt;sid&gt;-1.1.0 — adds a category field to every notice and a pinned Boolean to at least one. When the environment variable FEATURE_PINNED equals true, pinned notices are listed first and the response body includes "pinnedFirst": true; otherwise the order is unchanged and the field is false.</w:t>
       </w:r>
     </w:p>
     <w:p>
@@ -673,39 +501,7 @@
         </w:numPr>
       </w:pPr>
       <w:r>
-        <w:t xml:space="preserve">Tag </w:t>
-      </w:r>
-      <w:proofErr w:type="gramStart"/>
-      <w:r>
-        <w:t>notice-board</w:t>
-      </w:r>
-      <w:proofErr w:type="gramEnd"/>
-      <w:r>
-        <w:t>:&lt;</w:t>
-      </w:r>
-      <w:proofErr w:type="spellStart"/>
-      <w:r>
-        <w:t>sid</w:t>
-      </w:r>
-      <w:proofErr w:type="spellEnd"/>
-      <w:r>
-        <w:t>&gt;-1.1.0 — adds a category field to every notice and a pinned Boolean to at least one. When the environment variable FEATURE_PINNED equals true, pinned notices are listed first and the response body includes "</w:t>
-      </w:r>
-      <w:proofErr w:type="spellStart"/>
-      <w:r>
-        <w:t>pinnedFirst</w:t>
-      </w:r>
-      <w:proofErr w:type="spellEnd"/>
-      <w:r>
-        <w:t xml:space="preserve">": true; </w:t>
-      </w:r>
-      <w:proofErr w:type="gramStart"/>
-      <w:r>
-        <w:t>otherwise</w:t>
-      </w:r>
-      <w:proofErr w:type="gramEnd"/>
-      <w:r>
-        <w:t xml:space="preserve"> the order is unchanged and the field is false.</w:t>
+        <w:t>Tag notice-board:&lt;sid&gt;-1.1.0 — adds a category field to every notice and a pinned Boolean to at least one. When the environment variable FEATURE_PINNED equals true, pinned notices are listed first and the response body includes "pinnedFirst": true; otherwise the order is unchanged and the field is false.</w:t>
       </w:r>
     </w:p>
     <w:p>
@@ -717,39 +513,7 @@
         </w:numPr>
       </w:pPr>
       <w:r>
-        <w:t xml:space="preserve">Tag </w:t>
-      </w:r>
-      <w:proofErr w:type="gramStart"/>
-      <w:r>
-        <w:t>notice-board</w:t>
-      </w:r>
-      <w:proofErr w:type="gramEnd"/>
-      <w:r>
-        <w:t>:&lt;</w:t>
-      </w:r>
-      <w:proofErr w:type="spellStart"/>
-      <w:r>
-        <w:t>sid</w:t>
-      </w:r>
-      <w:proofErr w:type="spellEnd"/>
-      <w:r>
-        <w:t>&gt;-1.2.0-broken — identical to 1.1.0 except that /</w:t>
-      </w:r>
-      <w:proofErr w:type="spellStart"/>
-      <w:r>
-        <w:t>healthz</w:t>
-      </w:r>
-      <w:proofErr w:type="spellEnd"/>
-      <w:r>
-        <w:t xml:space="preserve"> never returns 200. /</w:t>
-      </w:r>
-      <w:proofErr w:type="gramStart"/>
-      <w:r>
-        <w:t>notices</w:t>
-      </w:r>
-      <w:proofErr w:type="gramEnd"/>
-      <w:r>
-        <w:t xml:space="preserve"> and /version still work.</w:t>
+        <w:t>Tag notice-board:&lt;sid&gt;-1.2.0-broken — identical to 1.1.0 except that /healthz never returns 200. /notices and /version still work.</w:t>
       </w:r>
     </w:p>
     <w:p>
@@ -769,14 +533,11 @@
         <w:ind w:left="360"/>
       </w:pPr>
       <w:r>
-        <w:rPr>
-          <w:noProof/>
-        </w:rPr>
         <w:drawing>
-          <wp:inline distT="0" distB="0" distL="0" distR="0" wp14:anchorId="33606A0B" wp14:editId="502D5D53">
-            <wp:extent cx="5943600" cy="2033905"/>
-            <wp:effectExtent l="0" t="0" r="0" b="4445"/>
-            <wp:docPr id="2060523505" name="Picture 1"/>
+          <wp:inline distT="0" distB="0" distL="0" distR="0" wp14:anchorId="76279537" wp14:editId="28AACFD7">
+            <wp:extent cx="5943600" cy="1762760"/>
+            <wp:effectExtent l="0" t="0" r="0" b="8890"/>
+            <wp:docPr id="53224646" name="Picture 1"/>
             <wp:cNvGraphicFramePr>
               <a:graphicFrameLocks xmlns:a="http://schemas.openxmlformats.org/drawingml/2006/main" noChangeAspect="1"/>
             </wp:cNvGraphicFramePr>
@@ -784,7 +545,7 @@
               <a:graphicData uri="http://schemas.openxmlformats.org/drawingml/2006/picture">
                 <pic:pic xmlns:pic="http://schemas.openxmlformats.org/drawingml/2006/picture">
                   <pic:nvPicPr>
-                    <pic:cNvPr id="2060523505" name=""/>
+                    <pic:cNvPr id="53224646" name=""/>
                     <pic:cNvPicPr/>
                   </pic:nvPicPr>
                   <pic:blipFill>
@@ -796,7 +557,7 @@
                   <pic:spPr>
                     <a:xfrm>
                       <a:off x="0" y="0"/>
-                      <a:ext cx="5943600" cy="2033905"/>
+                      <a:ext cx="5943600" cy="1762760"/>
                     </a:xfrm>
                     <a:prstGeom prst="rect">
                       <a:avLst/>
@@ -814,14 +575,11 @@
         <w:ind w:left="360"/>
       </w:pPr>
       <w:r>
-        <w:rPr>
-          <w:noProof/>
-        </w:rPr>
         <w:drawing>
-          <wp:inline distT="0" distB="0" distL="0" distR="0" wp14:anchorId="51FED642" wp14:editId="7641E2B4">
-            <wp:extent cx="5943600" cy="1664335"/>
-            <wp:effectExtent l="0" t="0" r="0" b="0"/>
-            <wp:docPr id="895811969" name="Picture 1"/>
+          <wp:inline distT="0" distB="0" distL="0" distR="0" wp14:anchorId="73263824" wp14:editId="67E57FE6">
+            <wp:extent cx="5943600" cy="1953895"/>
+            <wp:effectExtent l="0" t="0" r="0" b="8255"/>
+            <wp:docPr id="233406068" name="Picture 1"/>
             <wp:cNvGraphicFramePr>
               <a:graphicFrameLocks xmlns:a="http://schemas.openxmlformats.org/drawingml/2006/main" noChangeAspect="1"/>
             </wp:cNvGraphicFramePr>
@@ -829,7 +587,7 @@
               <a:graphicData uri="http://schemas.openxmlformats.org/drawingml/2006/picture">
                 <pic:pic xmlns:pic="http://schemas.openxmlformats.org/drawingml/2006/picture">
                   <pic:nvPicPr>
-                    <pic:cNvPr id="895811969" name=""/>
+                    <pic:cNvPr id="233406068" name=""/>
                     <pic:cNvPicPr/>
                   </pic:nvPicPr>
                   <pic:blipFill>
@@ -841,7 +599,7 @@
                   <pic:spPr>
                     <a:xfrm>
                       <a:off x="0" y="0"/>
-                      <a:ext cx="5943600" cy="1664335"/>
+                      <a:ext cx="5943600" cy="1953895"/>
                     </a:xfrm>
                     <a:prstGeom prst="rect">
                       <a:avLst/>
@@ -859,15 +617,12 @@
         <w:ind w:left="360"/>
       </w:pPr>
       <w:r>
-        <w:rPr>
-          <w:noProof/>
-        </w:rPr>
         <w:lastRenderedPageBreak/>
         <w:drawing>
-          <wp:inline distT="0" distB="0" distL="0" distR="0" wp14:anchorId="3B86524C" wp14:editId="0DD4B052">
-            <wp:extent cx="5943600" cy="1702435"/>
-            <wp:effectExtent l="0" t="0" r="0" b="0"/>
-            <wp:docPr id="1175169156" name="Picture 1"/>
+          <wp:inline distT="0" distB="0" distL="0" distR="0" wp14:anchorId="300B888B" wp14:editId="41939A13">
+            <wp:extent cx="5943600" cy="1802765"/>
+            <wp:effectExtent l="0" t="0" r="0" b="6985"/>
+            <wp:docPr id="1739977051" name="Picture 1"/>
             <wp:cNvGraphicFramePr>
               <a:graphicFrameLocks xmlns:a="http://schemas.openxmlformats.org/drawingml/2006/main" noChangeAspect="1"/>
             </wp:cNvGraphicFramePr>
@@ -875,7 +630,7 @@
               <a:graphicData uri="http://schemas.openxmlformats.org/drawingml/2006/picture">
                 <pic:pic xmlns:pic="http://schemas.openxmlformats.org/drawingml/2006/picture">
                   <pic:nvPicPr>
-                    <pic:cNvPr id="1175169156" name=""/>
+                    <pic:cNvPr id="1739977051" name=""/>
                     <pic:cNvPicPr/>
                   </pic:nvPicPr>
                   <pic:blipFill>
@@ -887,7 +642,7 @@
                   <pic:spPr>
                     <a:xfrm>
                       <a:off x="0" y="0"/>
-                      <a:ext cx="5943600" cy="1702435"/>
+                      <a:ext cx="5943600" cy="1802765"/>
                     </a:xfrm>
                     <a:prstGeom prst="rect">
                       <a:avLst/>
@@ -904,20 +659,12 @@
       <w:pPr>
         <w:ind w:left="360"/>
       </w:pPr>
-    </w:p>
-    <w:p>
-      <w:pPr>
-        <w:ind w:left="360"/>
-      </w:pPr>
-      <w:r>
-        <w:rPr>
-          <w:noProof/>
-        </w:rPr>
+      <w:r>
         <w:drawing>
-          <wp:inline distT="0" distB="0" distL="0" distR="0" wp14:anchorId="75C1789A" wp14:editId="3DEE4293">
-            <wp:extent cx="5943600" cy="384175"/>
+          <wp:inline distT="0" distB="0" distL="0" distR="0" wp14:anchorId="2DEE63AB" wp14:editId="03B412A0">
+            <wp:extent cx="5943600" cy="1849120"/>
             <wp:effectExtent l="0" t="0" r="0" b="0"/>
-            <wp:docPr id="1332236067" name="Picture 1"/>
+            <wp:docPr id="884106242" name="Picture 1"/>
             <wp:cNvGraphicFramePr>
               <a:graphicFrameLocks xmlns:a="http://schemas.openxmlformats.org/drawingml/2006/main" noChangeAspect="1"/>
             </wp:cNvGraphicFramePr>
@@ -925,7 +672,7 @@
               <a:graphicData uri="http://schemas.openxmlformats.org/drawingml/2006/picture">
                 <pic:pic xmlns:pic="http://schemas.openxmlformats.org/drawingml/2006/picture">
                   <pic:nvPicPr>
-                    <pic:cNvPr id="1332236067" name=""/>
+                    <pic:cNvPr id="884106242" name=""/>
                     <pic:cNvPicPr/>
                   </pic:nvPicPr>
                   <pic:blipFill>
@@ -937,7 +684,7 @@
                   <pic:spPr>
                     <a:xfrm>
                       <a:off x="0" y="0"/>
-                      <a:ext cx="5943600" cy="384175"/>
+                      <a:ext cx="5943600" cy="1849120"/>
                     </a:xfrm>
                     <a:prstGeom prst="rect">
                       <a:avLst/>
@@ -955,14 +702,11 @@
         <w:ind w:left="360"/>
       </w:pPr>
       <w:r>
-        <w:rPr>
-          <w:noProof/>
-        </w:rPr>
         <w:drawing>
-          <wp:inline distT="0" distB="0" distL="0" distR="0" wp14:anchorId="0F6729CB" wp14:editId="29CC871C">
-            <wp:extent cx="5943600" cy="414020"/>
-            <wp:effectExtent l="0" t="0" r="0" b="5080"/>
-            <wp:docPr id="1322575534" name="Picture 1"/>
+          <wp:inline distT="0" distB="0" distL="0" distR="0" wp14:anchorId="20CE32F0" wp14:editId="22421E2E">
+            <wp:extent cx="5943600" cy="877570"/>
+            <wp:effectExtent l="0" t="0" r="0" b="0"/>
+            <wp:docPr id="1874123949" name="Picture 1"/>
             <wp:cNvGraphicFramePr>
               <a:graphicFrameLocks xmlns:a="http://schemas.openxmlformats.org/drawingml/2006/main" noChangeAspect="1"/>
             </wp:cNvGraphicFramePr>
@@ -970,7 +714,7 @@
               <a:graphicData uri="http://schemas.openxmlformats.org/drawingml/2006/picture">
                 <pic:pic xmlns:pic="http://schemas.openxmlformats.org/drawingml/2006/picture">
                   <pic:nvPicPr>
-                    <pic:cNvPr id="1322575534" name=""/>
+                    <pic:cNvPr id="1874123949" name=""/>
                     <pic:cNvPicPr/>
                   </pic:nvPicPr>
                   <pic:blipFill>
@@ -982,7 +726,7 @@
                   <pic:spPr>
                     <a:xfrm>
                       <a:off x="0" y="0"/>
-                      <a:ext cx="5943600" cy="414020"/>
+                      <a:ext cx="5943600" cy="877570"/>
                     </a:xfrm>
                     <a:prstGeom prst="rect">
                       <a:avLst/>
@@ -1000,14 +744,11 @@
         <w:ind w:left="360"/>
       </w:pPr>
       <w:r>
-        <w:rPr>
-          <w:noProof/>
-        </w:rPr>
         <w:drawing>
-          <wp:inline distT="0" distB="0" distL="0" distR="0" wp14:anchorId="43A47FC6" wp14:editId="401C2DE9">
-            <wp:extent cx="5943600" cy="417195"/>
-            <wp:effectExtent l="0" t="0" r="0" b="1905"/>
-            <wp:docPr id="700844917" name="Picture 1"/>
+          <wp:inline distT="0" distB="0" distL="0" distR="0" wp14:anchorId="3CFDB6A5" wp14:editId="3B1CA4E6">
+            <wp:extent cx="5943600" cy="769620"/>
+            <wp:effectExtent l="0" t="0" r="0" b="0"/>
+            <wp:docPr id="877203796" name="Picture 1"/>
             <wp:cNvGraphicFramePr>
               <a:graphicFrameLocks xmlns:a="http://schemas.openxmlformats.org/drawingml/2006/main" noChangeAspect="1"/>
             </wp:cNvGraphicFramePr>
@@ -1015,7 +756,7 @@
               <a:graphicData uri="http://schemas.openxmlformats.org/drawingml/2006/picture">
                 <pic:pic xmlns:pic="http://schemas.openxmlformats.org/drawingml/2006/picture">
                   <pic:nvPicPr>
-                    <pic:cNvPr id="700844917" name=""/>
+                    <pic:cNvPr id="877203796" name=""/>
                     <pic:cNvPicPr/>
                   </pic:nvPicPr>
                   <pic:blipFill>
@@ -1027,7 +768,7 @@
                   <pic:spPr>
                     <a:xfrm>
                       <a:off x="0" y="0"/>
-                      <a:ext cx="5943600" cy="417195"/>
+                      <a:ext cx="5943600" cy="769620"/>
                     </a:xfrm>
                     <a:prstGeom prst="rect">
                       <a:avLst/>
@@ -1045,14 +786,11 @@
         <w:ind w:left="360"/>
       </w:pPr>
       <w:r>
-        <w:rPr>
-          <w:noProof/>
-        </w:rPr>
         <w:drawing>
-          <wp:inline distT="0" distB="0" distL="0" distR="0" wp14:anchorId="68696986" wp14:editId="4C422449">
-            <wp:extent cx="5943600" cy="1035050"/>
+          <wp:inline distT="0" distB="0" distL="0" distR="0" wp14:anchorId="722B4165" wp14:editId="0062976C">
+            <wp:extent cx="5943600" cy="1263015"/>
             <wp:effectExtent l="0" t="0" r="0" b="0"/>
-            <wp:docPr id="408501953" name="Picture 1"/>
+            <wp:docPr id="1460871010" name="Picture 1"/>
             <wp:cNvGraphicFramePr>
               <a:graphicFrameLocks xmlns:a="http://schemas.openxmlformats.org/drawingml/2006/main" noChangeAspect="1"/>
             </wp:cNvGraphicFramePr>
@@ -1060,7 +798,7 @@
               <a:graphicData uri="http://schemas.openxmlformats.org/drawingml/2006/picture">
                 <pic:pic xmlns:pic="http://schemas.openxmlformats.org/drawingml/2006/picture">
                   <pic:nvPicPr>
-                    <pic:cNvPr id="408501953" name=""/>
+                    <pic:cNvPr id="1460871010" name=""/>
                     <pic:cNvPicPr/>
                   </pic:nvPicPr>
                   <pic:blipFill>
@@ -1072,7 +810,7 @@
                   <pic:spPr>
                     <a:xfrm>
                       <a:off x="0" y="0"/>
-                      <a:ext cx="5943600" cy="1035050"/>
+                      <a:ext cx="5943600" cy="1263015"/>
                     </a:xfrm>
                     <a:prstGeom prst="rect">
                       <a:avLst/>
@@ -1089,56 +827,6 @@
       <w:pPr>
         <w:ind w:left="360"/>
       </w:pPr>
-      <w:r>
-        <w:rPr>
-          <w:noProof/>
-        </w:rPr>
-        <w:drawing>
-          <wp:inline distT="0" distB="0" distL="0" distR="0" wp14:anchorId="3B33122B" wp14:editId="3CEC41A5">
-            <wp:extent cx="5943600" cy="908685"/>
-            <wp:effectExtent l="0" t="0" r="0" b="5715"/>
-            <wp:docPr id="1191748277" name="Picture 1"/>
-            <wp:cNvGraphicFramePr>
-              <a:graphicFrameLocks xmlns:a="http://schemas.openxmlformats.org/drawingml/2006/main" noChangeAspect="1"/>
-            </wp:cNvGraphicFramePr>
-            <a:graphic xmlns:a="http://schemas.openxmlformats.org/drawingml/2006/main">
-              <a:graphicData uri="http://schemas.openxmlformats.org/drawingml/2006/picture">
-                <pic:pic xmlns:pic="http://schemas.openxmlformats.org/drawingml/2006/picture">
-                  <pic:nvPicPr>
-                    <pic:cNvPr id="1191748277" name=""/>
-                    <pic:cNvPicPr/>
-                  </pic:nvPicPr>
-                  <pic:blipFill>
-                    <a:blip r:embed="rId21"/>
-                    <a:stretch>
-                      <a:fillRect/>
-                    </a:stretch>
-                  </pic:blipFill>
-                  <pic:spPr>
-                    <a:xfrm>
-                      <a:off x="0" y="0"/>
-                      <a:ext cx="5943600" cy="908685"/>
-                    </a:xfrm>
-                    <a:prstGeom prst="rect">
-                      <a:avLst/>
-                    </a:prstGeom>
-                  </pic:spPr>
-                </pic:pic>
-              </a:graphicData>
-            </a:graphic>
-          </wp:inline>
-        </w:drawing>
-      </w:r>
-    </w:p>
-    <w:p>
-      <w:pPr>
-        <w:ind w:left="360"/>
-      </w:pPr>
-    </w:p>
-    <w:p>
-      <w:pPr>
-        <w:ind w:left="360"/>
-      </w:pPr>
     </w:p>
     <w:p>
       <w:pPr>
@@ -1168,23 +856,8 @@
         </w:rPr>
       </w:pPr>
       <w:r>
-        <w:t xml:space="preserve">Create a Deployment </w:t>
-      </w:r>
-      <w:proofErr w:type="gramStart"/>
-      <w:r>
-        <w:t>notice-board</w:t>
-      </w:r>
-      <w:proofErr w:type="gramEnd"/>
-      <w:r>
-        <w:t xml:space="preserve"> running 3 replicas of 1.0.0, with labels app=</w:t>
-      </w:r>
-      <w:proofErr w:type="gramStart"/>
-      <w:r>
-        <w:t>notice-board</w:t>
-      </w:r>
-      <w:proofErr w:type="gramEnd"/>
-      <w:r>
-        <w:t xml:space="preserve"> and version=&lt;image version&gt; on the Pods.</w:t>
+        <w:lastRenderedPageBreak/>
+        <w:t>Create a Deployment notice-board running 3 replicas of 1.0.0, with labels app=notice-board and version=&lt;image version&gt; on the Pods.</w:t>
       </w:r>
     </w:p>
     <w:p>
@@ -1200,15 +873,7 @@
         </w:rPr>
       </w:pPr>
       <w:r>
-        <w:t xml:space="preserve">Declare requests and limits for the container that </w:t>
-      </w:r>
-      <w:proofErr w:type="gramStart"/>
-      <w:r>
-        <w:t>fit</w:t>
-      </w:r>
-      <w:proofErr w:type="gramEnd"/>
-      <w:r>
-        <w:t xml:space="preserve"> inside your quota with room for Tasks 5 to 8.</w:t>
+        <w:t>Declare requests and limits for the container that fit inside your quota with room for Tasks 5 to 8.</w:t>
       </w:r>
     </w:p>
     <w:p>
@@ -1224,23 +889,7 @@
         </w:rPr>
       </w:pPr>
       <w:r>
-        <w:t>Configure a readiness probe against /</w:t>
-      </w:r>
-      <w:proofErr w:type="spellStart"/>
-      <w:r>
-        <w:t>healthz</w:t>
-      </w:r>
-      <w:proofErr w:type="spellEnd"/>
-      <w:r>
-        <w:t>. Configure a liveness probe that does not use /</w:t>
-      </w:r>
-      <w:proofErr w:type="spellStart"/>
-      <w:r>
-        <w:t>healthz</w:t>
-      </w:r>
-      <w:proofErr w:type="spellEnd"/>
-      <w:r>
-        <w:t>; state in a comment why.</w:t>
+        <w:t>Configure a readiness probe against /healthz. Configure a liveness probe that does not use /healthz; state in a comment why.</w:t>
       </w:r>
     </w:p>
     <w:p>
@@ -1256,16 +905,7 @@
         </w:rPr>
       </w:pPr>
       <w:r>
-        <w:lastRenderedPageBreak/>
-        <w:t xml:space="preserve">Ensure the </w:t>
-      </w:r>
-      <w:proofErr w:type="spellStart"/>
-      <w:r>
-        <w:t>kubelet</w:t>
-      </w:r>
-      <w:proofErr w:type="spellEnd"/>
-      <w:r>
-        <w:t xml:space="preserve"> can never attempt a registry pull for this image.</w:t>
+        <w:t>Ensure the kubelet can never attempt a registry pull for this image.</w:t>
       </w:r>
     </w:p>
     <w:p>
@@ -1281,39 +921,7 @@
         </w:rPr>
       </w:pPr>
       <w:r>
-        <w:t xml:space="preserve">Create a </w:t>
-      </w:r>
-      <w:proofErr w:type="spellStart"/>
-      <w:r>
-        <w:t>ClusterIP</w:t>
-      </w:r>
-      <w:proofErr w:type="spellEnd"/>
-      <w:r>
-        <w:t xml:space="preserve"> Service </w:t>
-      </w:r>
-      <w:proofErr w:type="gramStart"/>
-      <w:r>
-        <w:t>notice-board</w:t>
-      </w:r>
-      <w:proofErr w:type="gramEnd"/>
-      <w:r>
-        <w:t xml:space="preserve"> (port 80 to the named container port) and a </w:t>
-      </w:r>
-      <w:proofErr w:type="spellStart"/>
-      <w:r>
-        <w:t>NodePort</w:t>
-      </w:r>
-      <w:proofErr w:type="spellEnd"/>
-      <w:r>
-        <w:t>. Service notice-board-</w:t>
-      </w:r>
-      <w:proofErr w:type="spellStart"/>
-      <w:r>
-        <w:t>ext</w:t>
-      </w:r>
-      <w:proofErr w:type="spellEnd"/>
-      <w:r>
-        <w:t xml:space="preserve"> on node port 30090.</w:t>
+        <w:t>Create a ClusterIP Service notice-board (port 80 to the named container port) and a NodePort. Service notice-board-ext on node port 30090.</w:t>
       </w:r>
     </w:p>
     <w:p>
@@ -1361,7 +969,7 @@
                     <pic:cNvPicPr/>
                   </pic:nvPicPr>
                   <pic:blipFill>
-                    <a:blip r:embed="rId22"/>
+                    <a:blip r:embed="rId21"/>
                     <a:stretch>
                       <a:fillRect/>
                     </a:stretch>
@@ -1411,7 +1019,7 @@
                     <pic:cNvPicPr/>
                   </pic:nvPicPr>
                   <pic:blipFill>
-                    <a:blip r:embed="rId23"/>
+                    <a:blip r:embed="rId22"/>
                     <a:stretch>
                       <a:fillRect/>
                     </a:stretch>
@@ -1461,7 +1069,7 @@
                     <pic:cNvPicPr/>
                   </pic:nvPicPr>
                   <pic:blipFill>
-                    <a:blip r:embed="rId24"/>
+                    <a:blip r:embed="rId23"/>
                     <a:stretch>
                       <a:fillRect/>
                     </a:stretch>
@@ -1502,23 +1110,7 @@
           <w:b/>
           <w:bCs/>
         </w:rPr>
-        <w:t xml:space="preserve">Task 4 — Availability Monitor and </w:t>
-      </w:r>
-      <w:proofErr w:type="spellStart"/>
-      <w:r>
-        <w:rPr>
-          <w:b/>
-          <w:bCs/>
-        </w:rPr>
-        <w:t>Summariser</w:t>
-      </w:r>
-      <w:proofErr w:type="spellEnd"/>
-      <w:r>
-        <w:rPr>
-          <w:b/>
-          <w:bCs/>
-        </w:rPr>
-        <w:t xml:space="preserve"> (15 minutes)</w:t>
+        <w:t>Task 4 — Availability Monitor and Summariser (15 minutes)</w:t>
       </w:r>
     </w:p>
     <w:p>
@@ -1540,6 +1132,7 @@
         </w:numPr>
       </w:pPr>
       <w:r>
+        <w:lastRenderedPageBreak/>
         <w:t>Create a Pod monitor in manifests/base/ that requests http://notice-board/version every</w:t>
       </w:r>
       <w:r>
@@ -1557,15 +1150,7 @@
     </w:p>
     <w:p>
       <w:r>
-        <w:t xml:space="preserve">2. Write scripts/summarise.sh. Given a saved monitor log as its only argument, it </w:t>
-      </w:r>
-      <w:proofErr w:type="gramStart"/>
-      <w:r>
-        <w:t>prints:</w:t>
-      </w:r>
-      <w:proofErr w:type="gramEnd"/>
-      <w:r>
-        <w:t xml:space="preserve"> total</w:t>
+        <w:t>2. Write scripts/summarise.sh. Given a saved monitor log as its only argument, it prints: total</w:t>
       </w:r>
     </w:p>
     <w:p>
@@ -1574,22 +1159,8 @@
       </w:r>
     </w:p>
     <w:p>
-      <w:proofErr w:type="gramStart"/>
-      <w:r>
-        <w:lastRenderedPageBreak/>
-        <w:t>version</w:t>
-      </w:r>
-      <w:proofErr w:type="gramEnd"/>
-      <w:r>
-        <w:t xml:space="preserve"> </w:t>
-      </w:r>
-      <w:proofErr w:type="gramStart"/>
-      <w:r>
-        <w:t>value</w:t>
-      </w:r>
-      <w:proofErr w:type="gramEnd"/>
-      <w:r>
-        <w:t>.</w:t>
+      <w:r>
+        <w:t>version value.</w:t>
       </w:r>
     </w:p>
     <w:p>

</xml_diff>